<commit_message>
Fix chairman certificate dates
</commit_message>
<xml_diff>
--- a/assets/templates/Templates/070 новый шабл.docx
+++ b/assets/templates/Templates/070 новый шабл.docx
@@ -808,7 +808,7 @@
                 <w:sz w:val="24"/>
                 <w:szCs w:val="24"/>
               </w:rPr>
-              <w:t>14</w:t>
+              <w:t>[VisitDate_DAY]</w:t>
             </w:r>
           </w:p>
         </w:tc>
@@ -871,7 +871,7 @@
                 <w:sz w:val="24"/>
                 <w:szCs w:val="24"/>
               </w:rPr>
-              <w:t xml:space="preserve">Января </w:t>
+              <w:t xml:space="preserve">[VisitDate_DATEMONTH]</w:t>
             </w:r>
           </w:p>
         </w:tc>
@@ -903,7 +903,7 @@
                 <w:sz w:val="24"/>
                 <w:szCs w:val="24"/>
               </w:rPr>
-              <w:t>20</w:t>
+              <w:t/>
             </w:r>
           </w:p>
         </w:tc>
@@ -934,7 +934,7 @@
                 <w:sz w:val="24"/>
                 <w:szCs w:val="24"/>
               </w:rPr>
-              <w:t xml:space="preserve"> 2</w:t>
+              <w:t xml:space="preserve">[VisitDate_YEAR]</w:t>
             </w:r>
             <w:r>
               <w:rPr>
@@ -943,7 +943,7 @@
                 <w:sz w:val="24"/>
                 <w:szCs w:val="24"/>
               </w:rPr>
-              <w:t>6</w:t>
+              <w:t/>
             </w:r>
           </w:p>
         </w:tc>
@@ -1213,7 +1213,7 @@
               <w:jc w:val="center"/>
             </w:pPr>
             <w:r>
-              <w:t>0</w:t>
+              <w:t>[BirthDateCalc_DIGIT1]</w:t>
             </w:r>
           </w:p>
         </w:tc>
@@ -1227,7 +1227,7 @@
               <w:jc w:val="center"/>
             </w:pPr>
             <w:r>
-              <w:t>6</w:t>
+              <w:t>[BirthDateCalc_DIGIT2]</w:t>
             </w:r>
           </w:p>
         </w:tc>
@@ -1263,7 +1263,7 @@
               <w:jc w:val="center"/>
             </w:pPr>
             <w:r>
-              <w:t>1</w:t>
+              <w:t>[BirthDateCalc_DIGIT3]</w:t>
             </w:r>
           </w:p>
         </w:tc>
@@ -1277,7 +1277,7 @@
               <w:jc w:val="center"/>
             </w:pPr>
             <w:r>
-              <w:t>2</w:t>
+              <w:t>[BirthDateCalc_DIGIT4]</w:t>
             </w:r>
           </w:p>
         </w:tc>
@@ -1313,7 +1313,7 @@
               <w:jc w:val="center"/>
             </w:pPr>
             <w:r>
-              <w:t>1</w:t>
+              <w:t>[BirthDateCalc_DIGIT5]</w:t>
             </w:r>
           </w:p>
         </w:tc>
@@ -1327,7 +1327,7 @@
               <w:jc w:val="center"/>
             </w:pPr>
             <w:r>
-              <w:t>9</w:t>
+              <w:t>[BirthDateCalc_DIGIT6]</w:t>
             </w:r>
           </w:p>
         </w:tc>
@@ -1341,7 +1341,7 @@
               <w:jc w:val="center"/>
             </w:pPr>
             <w:r>
-              <w:t>9</w:t>
+              <w:t>[BirthDateCalc_DIGIT7]</w:t>
             </w:r>
           </w:p>
         </w:tc>
@@ -1355,7 +1355,7 @@
               <w:jc w:val="center"/>
             </w:pPr>
             <w:r>
-              <w:t>0</w:t>
+              <w:t>[BirthDateCalc_DIGIT8]</w:t>
             </w:r>
           </w:p>
         </w:tc>

</xml_diff>